<commit_message>
Updated Project Definition Form
+ specified Gantt Chart is public viewable on GitHub

+ added link to URL, kept text as URL for better direction if print format
</commit_message>
<xml_diff>
--- a/Final Year/CS3IP/CS3IP Project Definition Form.docx
+++ b/Final Year/CS3IP/CS3IP Project Definition Form.docx
@@ -447,10 +447,20 @@
               <w:rPr>
                 <w:rtl w:val="0"/>
               </w:rPr>
-              <w:t xml:space="preserve">Gantt Chart built within GitHub Project View.</w:t>
+              <w:t xml:space="preserve">Gantt Chart built within GitHub Project View (Public view available).</w:t>
               <w:br w:type="textWrapping"/>
-              <w:t xml:space="preserve">See: https://github.com/users/ProfProgram/projects/3/views/1</w:t>
-            </w:r>
+              <w:t xml:space="preserve">See: </w:t>
+            </w:r>
+            <w:hyperlink r:id="rId6">
+              <w:r>
+                <w:rPr>
+                  <w:color w:val="1155cc"/>
+                  <w:u w:val="single"/>
+                  <w:rtl w:val="0"/>
+                </w:rPr>
+                <w:t xml:space="preserve">https://github.com/users/ProfProgram/projects/3/views/1</w:t>
+              </w:r>
+            </w:hyperlink>
             <w:r>
               <w:rPr>
                 <w:rtl w:val="0"/>
@@ -471,7 +481,7 @@
       </w:r>
     </w:p>
     <w:sectPr>
-      <w:footerReference r:id="rId6" w:type="default"/>
+      <w:footerReference r:id="rId7" w:type="default"/>
       <w:pgSz w:h="16838" w:w="11906" w:orient="portrait"/>
       <w:pgMar w:bottom="1440" w:top="1440" w:left="1440" w:right="1440" w:header="708" w:footer="708"/>
       <w:pgNumType w:start="1"/>

</xml_diff>